<commit_message>
Highlight GFF leadership, data analysis and HOSSPI
</commit_message>
<xml_diff>
--- a/applications/agromavericks/Wasswa_Wilson_Application_AgroMavericks.docx
+++ b/applications/agromavericks/Wasswa_Wilson_Application_AgroMavericks.docx
@@ -123,7 +123,19 @@
           <w:rFonts w:ascii="Calibri" w:hAnsi="Calibri"/>
           <w:sz w:val="21"/>
         </w:rPr>
-        <w:t>I have practical experience with the technologies in your job post, including Next.js, TypeScript, Tailwind CSS, React Native and Expo, Convex, Better Auth, Resend, WhatsApp messaging, Bunny.net, Vercel, and EAS. I also work with Node.js APIs, SQL databases, Prisma, JWT and role-based access, testing, and CI/CD, plus Java, PHP, MySQL, Azure, and AWS. At FairBanks Medical Centre I currently lead FCHIP and hospital software. I have also shipped Shulekeeper (Next.js, TypeScript, Laravel, AWS), endoscopy reporting software for two hospitals, and the Wekebere Android monitoring app. Separately, I built and deployed an AI reception agent for a law firm in Texas that answers calls, manages appointments, and follows up with clients - and it is in active use.</w:t>
+        <w:t>I have practical experience with the technologies in your job post, including Next.js, TypeScript, Tailwind CSS, React Native and Expo, Convex, Better Auth, Resend, WhatsApp messaging, Bunny.net, Vercel, and EAS. I also work with Node.js APIs, SQL databases, Prisma, JWT and role-based access, testing, and CI/CD, plus Java, PHP, MySQL, Azure, and AWS. At FairBanks Medical Centre I lead FCHIP development and analyse health data with Python, SQL, data-quality checks, and dashboards. I am the Founder and Developer of HOSSPI (https://hosspi.com/), connecting hospital workflows and live analytics. I have also shipped Shulekeeper (Next.js, TypeScript, Laravel, AWS), endoscopy reporting software for two hospitals, and the Wekebere Android monitoring app. Separately, I built and deployed an AI reception agent for a law firm in Texas that answers calls, manages appointments, and follows up with clients - and it is in active use.</w:t>
+      </w:r>
+    </w:p>
+    <w:p>
+      <w:pPr>
+        <w:spacing w:after="120" w:before="0"/>
+      </w:pPr>
+      <w:r>
+        <w:rPr>
+          <w:rFonts w:ascii="Calibri" w:hAnsi="Calibri"/>
+          <w:sz w:val="21"/>
+        </w:rPr>
+        <w:t>As Biomedical Programs Manager at Gould Family Foundation (GFF), I led biomedical engineers and technicians across Uganda, Kenya, Tanzania, Burundi, Malawi, Somaliland, and Rwanda.</w:t>
       </w:r>
     </w:p>
     <w:p>

</xml_diff>

<commit_message>
Rebalance career experience and clinical training
</commit_message>
<xml_diff>
--- a/applications/agromavericks/Wasswa_Wilson_Application_AgroMavericks.docx
+++ b/applications/agromavericks/Wasswa_Wilson_Application_AgroMavericks.docx
@@ -123,7 +123,7 @@
           <w:rFonts w:ascii="Calibri" w:hAnsi="Calibri"/>
           <w:sz w:val="21"/>
         </w:rPr>
-        <w:t>I have practical experience with the technologies in your job post, including Next.js, TypeScript, Tailwind CSS, React Native and Expo, Convex, Better Auth, Resend, WhatsApp messaging, Bunny.net, Vercel, and EAS. I also work with Node.js APIs, SQL databases, Prisma, JWT and role-based access, testing, and CI/CD, plus Java, PHP, MySQL, Azure, and AWS. At FairBanks Medical Centre I lead FCHIP development and analyse health data with Python, SQL, data-quality checks, and dashboards. I am the Founder and Developer of HOSSPI (https://hosspi.com/), connecting hospital workflows and live analytics. I have also shipped Shulekeeper (Next.js, TypeScript, Laravel, AWS), endoscopy reporting software for two hospitals, and the Wekebere Android monitoring app. Separately, I built and deployed an AI reception agent for a law firm in Texas that answers calls, manages appointments, and follows up with clients - and it is in active use.</w:t>
+        <w:t>I have practical experience with the technologies in your job post, including Next.js, TypeScript, Tailwind CSS, React Native and Expo, Convex, Better Auth, Resend, WhatsApp messaging, Bunny.net, Vercel, and EAS. I also work with Node.js APIs, SQL databases, Prisma, JWT and role-based access, testing, and CI/CD, plus Java, PHP, MySQL, Azure, and AWS. I am the Founder and Developer of HOSSPI (https://hosspi.com/), connecting hospital workflows and live analytics. I have also shipped Shulekeeper (Next.js, TypeScript, Laravel, AWS), endoscopy reporting software for two hospitals, and the Wekebere Android monitoring app. Separately, I built and deployed an AI reception agent for a law firm in Texas that answers calls, manages appointments, and follows up with clients - and it is in active use. My analytical experience includes oxygen-demand modelling and compliance evidence at IHK, laboratory data analysis and Python research pipelines at UVRI, and current FCHIP analysis using Python, SQL, data-quality checks, and dashboards at FairBanks Medical Centre.</w:t>
       </w:r>
     </w:p>
     <w:p>
@@ -135,7 +135,7 @@
           <w:rFonts w:ascii="Calibri" w:hAnsi="Calibri"/>
           <w:sz w:val="21"/>
         </w:rPr>
-        <w:t>As Biomedical Programs Manager at Gould Family Foundation (GFF), I led biomedical engineers and technicians across Uganda, Kenya, Tanzania, Burundi, Malawi, Somaliland, and Rwanda.</w:t>
+        <w:t>As Biomedical Programs Manager at Gould Family Foundation (GFF), I led biomedical engineers and technicians across Uganda, Kenya, Tanzania, Burundi, Malawi, Somaliland, and Rwanda. I trained engineering teams and clinical users, including doctors, nurses, and apprentices.</w:t>
       </w:r>
     </w:p>
     <w:p>

</xml_diff>

<commit_message>
Detail biomedical equipment projects and advisory work
</commit_message>
<xml_diff>
--- a/applications/agromavericks/Wasswa_Wilson_Application_AgroMavericks.docx
+++ b/applications/agromavericks/Wasswa_Wilson_Application_AgroMavericks.docx
@@ -123,7 +123,7 @@
           <w:rFonts w:ascii="Calibri" w:hAnsi="Calibri"/>
           <w:sz w:val="21"/>
         </w:rPr>
-        <w:t>I have practical experience with the technologies in your job post, including Next.js, TypeScript, Tailwind CSS, React Native and Expo, Convex, Better Auth, Resend, WhatsApp messaging, Bunny.net, Vercel, and EAS. I also work with Node.js APIs, SQL databases, Prisma, JWT and role-based access, testing, and CI/CD, plus Java, PHP, MySQL, Azure, and AWS. I am the Founder and Developer of HOSSPI (https://hosspi.com/), connecting hospital workflows and live analytics. I have also shipped Shulekeeper (Next.js, TypeScript, Laravel, AWS), endoscopy reporting software for two hospitals, and the Wekebere Android monitoring app. Separately, I built and deployed an AI reception agent for a law firm in Texas that answers calls, manages appointments, and follows up with clients - and it is in active use. My analytical experience includes oxygen-demand modelling and compliance evidence at IHK, laboratory data analysis and Python research pipelines at UVRI, and current FCHIP analysis using Python, SQL, data-quality checks, and dashboards at FairBanks Medical Centre.</w:t>
+        <w:t>I have practical experience with the technologies in your job post, including Next.js, TypeScript, Tailwind CSS, React Native and Expo, Convex, Better Auth, Resend, WhatsApp messaging, Bunny.net, Vercel, and EAS. I also work with Node.js APIs, SQL databases, Prisma, JWT and role-based access, testing, and CI/CD, plus Java, PHP, MySQL, Azure, and AWS. I am the Founder and Developer of HOSSPI (https://hosspi.com/), connecting hospital workflows and live analytics. I have also shipped Shulekeeper (Next.js, TypeScript, Laravel, AWS), endoscopy reporting software for two hospitals, and the Wekebere Android monitoring app. Separately, I built and deployed an AI reception agent for a law firm in Texas that answers calls, manages appointments, and follows up with clients - and it is in active use. At IHK I led 64-slice CT and digital X-ray installation; my analytical experience includes oxygen-demand modelling and compliance evidence there, laboratory data analysis and Python research pipelines at UVRI, and current FCHIP analysis using Python, SQL, data-quality checks, and dashboards at FairBanks Medical Centre.</w:t>
       </w:r>
     </w:p>
     <w:p>
@@ -135,7 +135,7 @@
           <w:rFonts w:ascii="Calibri" w:hAnsi="Calibri"/>
           <w:sz w:val="21"/>
         </w:rPr>
-        <w:t>As Biomedical Programs Manager at Gould Family Foundation (GFF), I led biomedical engineers and technicians across Uganda, Kenya, Tanzania, Burundi, Malawi, Somaliland, and Rwanda. I trained engineering teams and clinical users, including doctors, nurses, and apprentices.</w:t>
+        <w:t>As Biomedical Programs Manager at Gould Family Foundation (GFF), I led biomedical engineers and technicians across Uganda, Kenya, Tanzania, Burundi, Malawi, Somaliland, and Rwanda. I trained engineering teams and clinical users, including doctors, nurses, and apprentices. I led the NICU upgrade at Mama Lucy Kibaki Hospital in Nairobi, Kenya, and developed equipment SOPs for partner facilities.</w:t>
       </w:r>
     </w:p>
     <w:p>

</xml_diff>